<commit_message>
market: card 5 -> TWSE margin maintenance ratio (financing only)
</commit_message>
<xml_diff>
--- a/日報/261030_報告總覽_夜間.docx
+++ b/日報/261030_報告總覽_夜間.docx
@@ -3,46 +3,34 @@
 <w:document xmlns:wpc="http://schemas.microsoft.com/office/word/2010/wordprocessingCanvas" xmlns:mo="http://schemas.microsoft.com/office/mac/office/2008/main" xmlns:mc="http://schemas.openxmlformats.org/markup-compatibility/2006" xmlns:mv="urn:schemas-microsoft-com:mac:vml" xmlns:o="urn:schemas-microsoft-com:office:office" xmlns:r="http://schemas.openxmlformats.org/officeDocument/2006/relationships" xmlns:m="http://schemas.openxmlformats.org/officeDocument/2006/math" xmlns:v="urn:schemas-microsoft-com:vml" xmlns:wp14="http://schemas.microsoft.com/office/word/2010/wordprocessingDrawing" xmlns:wp="http://schemas.openxmlformats.org/drawingml/2006/wordprocessingDrawing" xmlns:w10="urn:schemas-microsoft-com:office:word" xmlns:w="http://schemas.openxmlformats.org/wordprocessingml/2006/main" xmlns:w14="http://schemas.microsoft.com/office/word/2010/wordml" xmlns:wpg="http://schemas.microsoft.com/office/word/2010/wordprocessingGroup" xmlns:wpi="http://schemas.microsoft.com/office/word/2010/wordprocessingInk" xmlns:wne="http://schemas.microsoft.com/office/word/2006/wordml" xmlns:wps="http://schemas.microsoft.com/office/word/2010/wordprocessingShape" mc:Ignorable="w14 wp14">
   <w:body>
     <w:p>
+      <w:pPr>
+        <w:pStyle w:val="Heading1"/>
+      </w:pPr>
       <w:r>
         <w:rPr>
           <w:rFonts w:ascii="Microsoft JhengHei" w:hAnsi="Microsoft JhengHei" w:eastAsia="Microsoft JhengHei"/>
-          <w:b/>
-          <w:sz w:val="28"/>
         </w:rPr>
         <w:t>261030｜報告總覽｜夜間</w:t>
       </w:r>
     </w:p>
     <w:p>
       <w:r>
-        <w:rPr>
-          <w:rFonts w:ascii="Microsoft JhengHei" w:hAnsi="Microsoft JhengHei" w:eastAsia="Microsoft JhengHei"/>
-          <w:b w:val="0"/>
-        </w:rPr>
         <w:t>台股券商研究報告　日報總覽</w:t>
       </w:r>
     </w:p>
     <w:p>
       <w:r>
-        <w:rPr>
-          <w:rFonts w:ascii="Microsoft JhengHei" w:hAnsi="Microsoft JhengHei" w:eastAsia="Microsoft JhengHei"/>
-          <w:b w:val="0"/>
-        </w:rPr>
-        <w:t>夜間場次｜2026 年 10 月 30 日（星期五）04:20 收錄　資料窗口：2026/10/29 13:00 – 10/30 04:16</w:t>
+        <w:t>夜間場次｜2026 年 10 月 30 日（星期五）20:55 收錄　資料窗口：2026/10/30 17:55 – 20:55（含本日稍早未收錄之券商觀點）</w:t>
       </w:r>
     </w:p>
     <w:p>
       <w:r>
-        <w:rPr>
-          <w:rFonts w:ascii="Microsoft JhengHei" w:hAnsi="Microsoft JhengHei" w:eastAsia="Microsoft JhengHei"/>
-          <w:b w:val="0"/>
-        </w:rPr>
         <w:t>整理：旺來 wowwow31001　｜　本報告依公開新聞整理，非券商完整報告原稿</w:t>
       </w:r>
     </w:p>
     <w:p>
       <w:r>
         <w:rPr>
-          <w:rFonts w:ascii="Microsoft JhengHei" w:hAnsi="Microsoft JhengHei" w:eastAsia="Microsoft JhengHei"/>
           <w:b/>
         </w:rPr>
         <w:t>一、本場次重點摘要</w:t>
@@ -50,35 +38,27 @@
     </w:p>
     <w:p>
       <w:r>
-        <w:rPr>
-          <w:rFonts w:ascii="Microsoft JhengHei" w:hAnsi="Microsoft JhengHei" w:eastAsia="Microsoft JhengHei"/>
-          <w:b w:val="0"/>
-        </w:rPr>
-        <w:t>• 聯電（2303）法說會後四大外資看法分歧：野村「買進」176 元、瑞銀「買進」目標價 230→200 元、花旗「買進」143 元、摩根大通「中立」135 元。</w:t>
+        <w:t>• 聯電（2303）：摩根士丹利維持「加碼」、目標價 188 元，引述公司預估 2029 年 AI 相關營收約 40 億美元、占總營收約 25%；花旗同步調升至 143 元（已於 10/29 收錄）。</w:t>
+      </w:r>
+    </w:p>
+    <w:p>
+      <w:r>
+        <w:t>• 欣興（3037）：本土投顧（未具名）維持「買進」、目標價由 1,010 元調升至 1,300 元，Q3 EPS 6.32 元，估 Q4 營收季增 14%。</w:t>
+      </w:r>
+    </w:p>
+    <w:p>
+      <w:r>
+        <w:t>• 台指期夜盤 20:04 報 44,979 點（-321 點），跌破 45,000 點；金管會表示已請證交所、櫃買中心密切注意國際金融市場變化，借券賣出占成交值 4.31%。</w:t>
+      </w:r>
+    </w:p>
+    <w:p>
+      <w:r>
+        <w:t>• 摩根大通首席經濟學家示警未來一年到一年半金融市場恐出現相當幅度修正（Business Insider Taiwan 19:53）。</w:t>
       </w:r>
     </w:p>
     <w:p>
       <w:r>
         <w:rPr>
-          <w:rFonts w:ascii="Microsoft JhengHei" w:hAnsi="Microsoft JhengHei" w:eastAsia="Microsoft JhengHei"/>
-          <w:b w:val="0"/>
-        </w:rPr>
-        <w:t>• 玉晶光（3406）美系外資（花旗）由「中立」升評「買進」，目標價 1,050→1,380 元，看好 EBO 高速光通訊商機。</w:t>
-      </w:r>
-    </w:p>
-    <w:p>
-      <w:r>
-        <w:rPr>
-          <w:rFonts w:ascii="Microsoft JhengHei" w:hAnsi="Microsoft JhengHei" w:eastAsia="Microsoft JhengHei"/>
-          <w:b w:val="0"/>
-        </w:rPr>
-        <w:t>• 市場：加權指數 10/29 收 46,368.33（-667.25，-1.42%），外資賣超 688 億元；美股 10/29 因 Alphabet 財報失色收低，那指 -1.66%、費半約 -2%。</w:t>
-      </w:r>
-    </w:p>
-    <w:p>
-      <w:r>
-        <w:rPr>
-          <w:rFonts w:ascii="Microsoft JhengHei" w:hAnsi="Microsoft JhengHei" w:eastAsia="Microsoft JhengHei"/>
           <w:b/>
         </w:rPr>
         <w:t>二、按產業分組</w:t>
@@ -104,13 +84,7 @@
             <w:tcW w:type="dxa" w:w="1440"/>
           </w:tcPr>
           <w:p>
-            <w:r/>
             <w:r>
-              <w:rPr>
-                <w:rFonts w:ascii="Microsoft JhengHei" w:hAnsi="Microsoft JhengHei" w:eastAsia="Microsoft JhengHei"/>
-                <w:b/>
-                <w:sz w:val="18"/>
-              </w:rPr>
               <w:t>產業</w:t>
             </w:r>
           </w:p>
@@ -120,13 +94,7 @@
             <w:tcW w:type="dxa" w:w="1440"/>
           </w:tcPr>
           <w:p>
-            <w:r/>
             <w:r>
-              <w:rPr>
-                <w:rFonts w:ascii="Microsoft JhengHei" w:hAnsi="Microsoft JhengHei" w:eastAsia="Microsoft JhengHei"/>
-                <w:b/>
-                <w:sz w:val="18"/>
-              </w:rPr>
               <w:t>個股</w:t>
             </w:r>
           </w:p>
@@ -136,13 +104,7 @@
             <w:tcW w:type="dxa" w:w="1440"/>
           </w:tcPr>
           <w:p>
-            <w:r/>
             <w:r>
-              <w:rPr>
-                <w:rFonts w:ascii="Microsoft JhengHei" w:hAnsi="Microsoft JhengHei" w:eastAsia="Microsoft JhengHei"/>
-                <w:b/>
-                <w:sz w:val="18"/>
-              </w:rPr>
               <w:t>券商</w:t>
             </w:r>
           </w:p>
@@ -152,13 +114,7 @@
             <w:tcW w:type="dxa" w:w="1440"/>
           </w:tcPr>
           <w:p>
-            <w:r/>
             <w:r>
-              <w:rPr>
-                <w:rFonts w:ascii="Microsoft JhengHei" w:hAnsi="Microsoft JhengHei" w:eastAsia="Microsoft JhengHei"/>
-                <w:b/>
-                <w:sz w:val="18"/>
-              </w:rPr>
               <w:t>評等</w:t>
             </w:r>
           </w:p>
@@ -168,13 +124,7 @@
             <w:tcW w:type="dxa" w:w="1440"/>
           </w:tcPr>
           <w:p>
-            <w:r/>
             <w:r>
-              <w:rPr>
-                <w:rFonts w:ascii="Microsoft JhengHei" w:hAnsi="Microsoft JhengHei" w:eastAsia="Microsoft JhengHei"/>
-                <w:b/>
-                <w:sz w:val="18"/>
-              </w:rPr>
               <w:t>目標價</w:t>
             </w:r>
           </w:p>
@@ -184,13 +134,7 @@
             <w:tcW w:type="dxa" w:w="1440"/>
           </w:tcPr>
           <w:p>
-            <w:r/>
             <w:r>
-              <w:rPr>
-                <w:rFonts w:ascii="Microsoft JhengHei" w:hAnsi="Microsoft JhengHei" w:eastAsia="Microsoft JhengHei"/>
-                <w:b/>
-                <w:sz w:val="18"/>
-              </w:rPr>
               <w:t>重點</w:t>
             </w:r>
           </w:p>
@@ -202,12 +146,7 @@
             <w:tcW w:type="dxa" w:w="1440"/>
           </w:tcPr>
           <w:p>
-            <w:r/>
             <w:r>
-              <w:rPr>
-                <w:rFonts w:ascii="Microsoft JhengHei" w:hAnsi="Microsoft JhengHei" w:eastAsia="Microsoft JhengHei"/>
-                <w:sz w:val="18"/>
-              </w:rPr>
               <w:t>半導體－晶圓代工</w:t>
             </w:r>
           </w:p>
@@ -217,12 +156,7 @@
             <w:tcW w:type="dxa" w:w="1440"/>
           </w:tcPr>
           <w:p>
-            <w:r/>
             <w:r>
-              <w:rPr>
-                <w:rFonts w:ascii="Microsoft JhengHei" w:hAnsi="Microsoft JhengHei" w:eastAsia="Microsoft JhengHei"/>
-                <w:sz w:val="18"/>
-              </w:rPr>
               <w:t>聯電(2303)</w:t>
             </w:r>
           </w:p>
@@ -232,13 +166,8 @@
             <w:tcW w:type="dxa" w:w="1440"/>
           </w:tcPr>
           <w:p>
-            <w:r/>
             <w:r>
-              <w:rPr>
-                <w:rFonts w:ascii="Microsoft JhengHei" w:hAnsi="Microsoft JhengHei" w:eastAsia="Microsoft JhengHei"/>
-                <w:sz w:val="18"/>
-              </w:rPr>
-              <w:t>野村證券 Nomura</w:t>
+              <w:t>摩根士丹利 Morgan Stanley</w:t>
             </w:r>
           </w:p>
         </w:tc>
@@ -247,13 +176,8 @@
             <w:tcW w:type="dxa" w:w="1440"/>
           </w:tcPr>
           <w:p>
-            <w:r/>
             <w:r>
-              <w:rPr>
-                <w:rFonts w:ascii="Microsoft JhengHei" w:hAnsi="Microsoft JhengHei" w:eastAsia="Microsoft JhengHei"/>
-                <w:sz w:val="18"/>
-              </w:rPr>
-              <w:t>買進（重申）</w:t>
+              <w:t>加碼（維持）</w:t>
             </w:r>
           </w:p>
         </w:tc>
@@ -262,13 +186,8 @@
             <w:tcW w:type="dxa" w:w="1440"/>
           </w:tcPr>
           <w:p>
-            <w:r/>
             <w:r>
-              <w:rPr>
-                <w:rFonts w:ascii="Microsoft JhengHei" w:hAnsi="Microsoft JhengHei" w:eastAsia="Microsoft JhengHei"/>
-                <w:sz w:val="18"/>
-              </w:rPr>
-              <w:t>176 元</w:t>
+              <w:t>188 元</w:t>
             </w:r>
           </w:p>
         </w:tc>
@@ -277,13 +196,8 @@
             <w:tcW w:type="dxa" w:w="1440"/>
           </w:tcPr>
           <w:p>
-            <w:r/>
             <w:r>
-              <w:rPr>
-                <w:rFonts w:ascii="Microsoft JhengHei" w:hAnsi="Microsoft JhengHei" w:eastAsia="Microsoft JhengHei"/>
-                <w:sz w:val="18"/>
-              </w:rPr>
-              <w:t>Q3 財報與 Q4 財測大致符合預期，以 2027～28 年平均 EPS 8.8 元、20 倍本益比評價</w:t>
+              <w:t>2029 年 AI 相關營收預估約 40 億美元、占營收約 25%；漲價扣除產品組合後實際約 5%～10%</w:t>
             </w:r>
           </w:p>
         </w:tc>
@@ -294,13 +208,8 @@
             <w:tcW w:type="dxa" w:w="1440"/>
           </w:tcPr>
           <w:p>
-            <w:r/>
             <w:r>
-              <w:rPr>
-                <w:rFonts w:ascii="Microsoft JhengHei" w:hAnsi="Microsoft JhengHei" w:eastAsia="Microsoft JhengHei"/>
-                <w:sz w:val="18"/>
-              </w:rPr>
-              <w:t>半導體－晶圓代工</w:t>
+              <w:t>電子零組件－ABF載板</w:t>
             </w:r>
           </w:p>
         </w:tc>
@@ -309,13 +218,8 @@
             <w:tcW w:type="dxa" w:w="1440"/>
           </w:tcPr>
           <w:p>
-            <w:r/>
             <w:r>
-              <w:rPr>
-                <w:rFonts w:ascii="Microsoft JhengHei" w:hAnsi="Microsoft JhengHei" w:eastAsia="Microsoft JhengHei"/>
-                <w:sz w:val="18"/>
-              </w:rPr>
-              <w:t>聯電(2303)</w:t>
+              <w:t>欣興(3037)</w:t>
             </w:r>
           </w:p>
         </w:tc>
@@ -324,13 +228,8 @@
             <w:tcW w:type="dxa" w:w="1440"/>
           </w:tcPr>
           <w:p>
-            <w:r/>
             <w:r>
-              <w:rPr>
-                <w:rFonts w:ascii="Microsoft JhengHei" w:hAnsi="Microsoft JhengHei" w:eastAsia="Microsoft JhengHei"/>
-                <w:sz w:val="18"/>
-              </w:rPr>
-              <w:t>摩根大通 J.P. Morgan</w:t>
+              <w:t>本土投顧（未具名）</w:t>
             </w:r>
           </w:p>
         </w:tc>
@@ -339,104 +238,7 @@
             <w:tcW w:type="dxa" w:w="1440"/>
           </w:tcPr>
           <w:p>
-            <w:r/>
             <w:r>
-              <w:rPr>
-                <w:rFonts w:ascii="Microsoft JhengHei" w:hAnsi="Microsoft JhengHei" w:eastAsia="Microsoft JhengHei"/>
-                <w:sz w:val="18"/>
-              </w:rPr>
-              <w:t>中立（維持）</w:t>
-            </w:r>
-          </w:p>
-        </w:tc>
-        <w:tc>
-          <w:tcPr>
-            <w:tcW w:type="dxa" w:w="1440"/>
-          </w:tcPr>
-          <w:p>
-            <w:r/>
-            <w:r>
-              <w:rPr>
-                <w:rFonts w:ascii="Microsoft JhengHei" w:hAnsi="Microsoft JhengHei" w:eastAsia="Microsoft JhengHei"/>
-                <w:sz w:val="18"/>
-              </w:rPr>
-              <w:t>135 元</w:t>
-            </w:r>
-          </w:p>
-        </w:tc>
-        <w:tc>
-          <w:tcPr>
-            <w:tcW w:type="dxa" w:w="1440"/>
-          </w:tcPr>
-          <w:p>
-            <w:r/>
-            <w:r>
-              <w:rPr>
-                <w:rFonts w:ascii="Microsoft JhengHei" w:hAnsi="Microsoft JhengHei" w:eastAsia="Microsoft JhengHei"/>
-                <w:sz w:val="18"/>
-              </w:rPr>
-              <w:t>2027 年 ASP 增幅約 10%，低於市場期待的 15～20%；毛利率估維持 40% 以下</w:t>
-            </w:r>
-          </w:p>
-        </w:tc>
-      </w:tr>
-      <w:tr>
-        <w:tc>
-          <w:tcPr>
-            <w:tcW w:type="dxa" w:w="1440"/>
-          </w:tcPr>
-          <w:p>
-            <w:r/>
-            <w:r>
-              <w:rPr>
-                <w:rFonts w:ascii="Microsoft JhengHei" w:hAnsi="Microsoft JhengHei" w:eastAsia="Microsoft JhengHei"/>
-                <w:sz w:val="18"/>
-              </w:rPr>
-              <w:t>半導體－晶圓代工</w:t>
-            </w:r>
-          </w:p>
-        </w:tc>
-        <w:tc>
-          <w:tcPr>
-            <w:tcW w:type="dxa" w:w="1440"/>
-          </w:tcPr>
-          <w:p>
-            <w:r/>
-            <w:r>
-              <w:rPr>
-                <w:rFonts w:ascii="Microsoft JhengHei" w:hAnsi="Microsoft JhengHei" w:eastAsia="Microsoft JhengHei"/>
-                <w:sz w:val="18"/>
-              </w:rPr>
-              <w:t>聯電(2303)</w:t>
-            </w:r>
-          </w:p>
-        </w:tc>
-        <w:tc>
-          <w:tcPr>
-            <w:tcW w:type="dxa" w:w="1440"/>
-          </w:tcPr>
-          <w:p>
-            <w:r/>
-            <w:r>
-              <w:rPr>
-                <w:rFonts w:ascii="Microsoft JhengHei" w:hAnsi="Microsoft JhengHei" w:eastAsia="Microsoft JhengHei"/>
-                <w:sz w:val="18"/>
-              </w:rPr>
-              <w:t>花旗環球 Citi</w:t>
-            </w:r>
-          </w:p>
-        </w:tc>
-        <w:tc>
-          <w:tcPr>
-            <w:tcW w:type="dxa" w:w="1440"/>
-          </w:tcPr>
-          <w:p>
-            <w:r/>
-            <w:r>
-              <w:rPr>
-                <w:rFonts w:ascii="Microsoft JhengHei" w:hAnsi="Microsoft JhengHei" w:eastAsia="Microsoft JhengHei"/>
-                <w:sz w:val="18"/>
-              </w:rPr>
               <w:t>買進（維持）</w:t>
             </w:r>
           </w:p>
@@ -446,13 +248,8 @@
             <w:tcW w:type="dxa" w:w="1440"/>
           </w:tcPr>
           <w:p>
-            <w:r/>
             <w:r>
-              <w:rPr>
-                <w:rFonts w:ascii="Microsoft JhengHei" w:hAnsi="Microsoft JhengHei" w:eastAsia="Microsoft JhengHei"/>
-                <w:sz w:val="18"/>
-              </w:rPr>
-              <w:t>143 元</w:t>
+              <w:t>1,300 元（前值 1,010 元）</w:t>
             </w:r>
           </w:p>
         </w:tc>
@@ -461,197 +258,8 @@
             <w:tcW w:type="dxa" w:w="1440"/>
           </w:tcPr>
           <w:p>
-            <w:r/>
             <w:r>
-              <w:rPr>
-                <w:rFonts w:ascii="Microsoft JhengHei" w:hAnsi="Microsoft JhengHei" w:eastAsia="Microsoft JhengHei"/>
-                <w:sz w:val="18"/>
-              </w:rPr>
-              <w:t>下修 2027／28 年 EPS 10%／8%，評價改採 2027～28 年 18 倍本益比</w:t>
-            </w:r>
-          </w:p>
-        </w:tc>
-      </w:tr>
-      <w:tr>
-        <w:tc>
-          <w:tcPr>
-            <w:tcW w:type="dxa" w:w="1440"/>
-          </w:tcPr>
-          <w:p>
-            <w:r/>
-            <w:r>
-              <w:rPr>
-                <w:rFonts w:ascii="Microsoft JhengHei" w:hAnsi="Microsoft JhengHei" w:eastAsia="Microsoft JhengHei"/>
-                <w:sz w:val="18"/>
-              </w:rPr>
-              <w:t>半導體－晶圓代工</w:t>
-            </w:r>
-          </w:p>
-        </w:tc>
-        <w:tc>
-          <w:tcPr>
-            <w:tcW w:type="dxa" w:w="1440"/>
-          </w:tcPr>
-          <w:p>
-            <w:r/>
-            <w:r>
-              <w:rPr>
-                <w:rFonts w:ascii="Microsoft JhengHei" w:hAnsi="Microsoft JhengHei" w:eastAsia="Microsoft JhengHei"/>
-                <w:sz w:val="18"/>
-              </w:rPr>
-              <w:t>聯電(2303)</w:t>
-            </w:r>
-          </w:p>
-        </w:tc>
-        <w:tc>
-          <w:tcPr>
-            <w:tcW w:type="dxa" w:w="1440"/>
-          </w:tcPr>
-          <w:p>
-            <w:r/>
-            <w:r>
-              <w:rPr>
-                <w:rFonts w:ascii="Microsoft JhengHei" w:hAnsi="Microsoft JhengHei" w:eastAsia="Microsoft JhengHei"/>
-                <w:sz w:val="18"/>
-              </w:rPr>
-              <w:t>瑞銀證券 UBS</w:t>
-            </w:r>
-          </w:p>
-        </w:tc>
-        <w:tc>
-          <w:tcPr>
-            <w:tcW w:type="dxa" w:w="1440"/>
-          </w:tcPr>
-          <w:p>
-            <w:r/>
-            <w:r>
-              <w:rPr>
-                <w:rFonts w:ascii="Microsoft JhengHei" w:hAnsi="Microsoft JhengHei" w:eastAsia="Microsoft JhengHei"/>
-                <w:sz w:val="18"/>
-              </w:rPr>
-              <w:t>買進（維持）</w:t>
-            </w:r>
-          </w:p>
-        </w:tc>
-        <w:tc>
-          <w:tcPr>
-            <w:tcW w:type="dxa" w:w="1440"/>
-          </w:tcPr>
-          <w:p>
-            <w:r/>
-            <w:r>
-              <w:rPr>
-                <w:rFonts w:ascii="Microsoft JhengHei" w:hAnsi="Microsoft JhengHei" w:eastAsia="Microsoft JhengHei"/>
-                <w:sz w:val="18"/>
-              </w:rPr>
-              <w:t>200 元（前值 230 元）</w:t>
-            </w:r>
-          </w:p>
-        </w:tc>
-        <w:tc>
-          <w:tcPr>
-            <w:tcW w:type="dxa" w:w="1440"/>
-          </w:tcPr>
-          <w:p>
-            <w:r/>
-            <w:r>
-              <w:rPr>
-                <w:rFonts w:ascii="Microsoft JhengHei" w:hAnsi="Microsoft JhengHei" w:eastAsia="Microsoft JhengHei"/>
-                <w:sz w:val="18"/>
-              </w:rPr>
-              <w:t>成本壓力下調 2027／28 年 EPS 2%／7%，目標本益比 23→21 倍；仍為四家外資最高</w:t>
-            </w:r>
-          </w:p>
-        </w:tc>
-      </w:tr>
-      <w:tr>
-        <w:tc>
-          <w:tcPr>
-            <w:tcW w:type="dxa" w:w="1440"/>
-          </w:tcPr>
-          <w:p>
-            <w:r/>
-            <w:r>
-              <w:rPr>
-                <w:rFonts w:ascii="Microsoft JhengHei" w:hAnsi="Microsoft JhengHei" w:eastAsia="Microsoft JhengHei"/>
-                <w:sz w:val="18"/>
-              </w:rPr>
-              <w:t>光電－光學鏡頭／CPO</w:t>
-            </w:r>
-          </w:p>
-        </w:tc>
-        <w:tc>
-          <w:tcPr>
-            <w:tcW w:type="dxa" w:w="1440"/>
-          </w:tcPr>
-          <w:p>
-            <w:r/>
-            <w:r>
-              <w:rPr>
-                <w:rFonts w:ascii="Microsoft JhengHei" w:hAnsi="Microsoft JhengHei" w:eastAsia="Microsoft JhengHei"/>
-                <w:sz w:val="18"/>
-              </w:rPr>
-              <w:t>玉晶光(3406)</w:t>
-            </w:r>
-          </w:p>
-        </w:tc>
-        <w:tc>
-          <w:tcPr>
-            <w:tcW w:type="dxa" w:w="1440"/>
-          </w:tcPr>
-          <w:p>
-            <w:r/>
-            <w:r>
-              <w:rPr>
-                <w:rFonts w:ascii="Microsoft JhengHei" w:hAnsi="Microsoft JhengHei" w:eastAsia="Microsoft JhengHei"/>
-                <w:sz w:val="18"/>
-              </w:rPr>
-              <w:t>花旗環球 Citi（美系外資）</w:t>
-            </w:r>
-          </w:p>
-        </w:tc>
-        <w:tc>
-          <w:tcPr>
-            <w:tcW w:type="dxa" w:w="1440"/>
-          </w:tcPr>
-          <w:p>
-            <w:r/>
-            <w:r>
-              <w:rPr>
-                <w:rFonts w:ascii="Microsoft JhengHei" w:hAnsi="Microsoft JhengHei" w:eastAsia="Microsoft JhengHei"/>
-                <w:sz w:val="18"/>
-              </w:rPr>
-              <w:t>升評至買進（原中立）</w:t>
-            </w:r>
-          </w:p>
-        </w:tc>
-        <w:tc>
-          <w:tcPr>
-            <w:tcW w:type="dxa" w:w="1440"/>
-          </w:tcPr>
-          <w:p>
-            <w:r/>
-            <w:r>
-              <w:rPr>
-                <w:rFonts w:ascii="Microsoft JhengHei" w:hAnsi="Microsoft JhengHei" w:eastAsia="Microsoft JhengHei"/>
-                <w:sz w:val="18"/>
-              </w:rPr>
-              <w:t>1,380 元（前值 1,050 元）</w:t>
-            </w:r>
-          </w:p>
-        </w:tc>
-        <w:tc>
-          <w:tcPr>
-            <w:tcW w:type="dxa" w:w="1440"/>
-          </w:tcPr>
-          <w:p>
-            <w:r/>
-            <w:r>
-              <w:rPr>
-                <w:rFonts w:ascii="Microsoft JhengHei" w:hAnsi="Microsoft JhengHei" w:eastAsia="Microsoft JhengHei"/>
-                <w:sz w:val="18"/>
-              </w:rPr>
-              <w:t>升評買進，看好 EBO 高速光通訊商機；Q3 EPS 9.69 元</w:t>
+              <w:t>ABF 稼動率估維持 90% 以上；明年 EPS 估 43.36 元、30 倍本益比</w:t>
             </w:r>
           </w:p>
         </w:tc>
@@ -660,7 +268,6 @@
     <w:p>
       <w:r>
         <w:rPr>
-          <w:rFonts w:ascii="Microsoft JhengHei" w:hAnsi="Microsoft JhengHei" w:eastAsia="Microsoft JhengHei"/>
           <w:b/>
         </w:rPr>
         <w:t>三、市場與大盤</w:t>
@@ -668,47 +275,25 @@
     </w:p>
     <w:p>
       <w:r>
-        <w:rPr>
-          <w:rFonts w:ascii="Microsoft JhengHei" w:hAnsi="Microsoft JhengHei" w:eastAsia="Microsoft JhengHei"/>
-          <w:b w:val="0"/>
-        </w:rPr>
-        <w:t>• 加權指數 10/29 收 46,368.33 點（-667.25，-1.42%），上市成交值 8,238 億元（前日 7,503 億元，+9.8%）——證交所官方值。</w:t>
+        <w:t>• 加權指數 10/30 收 45,211.83 點（-1,156.50，-2.49%），成交值 8,777.3 億元（鉅亨網、中央社報導）；外資賣超 1,124.67 億元、投信買超 239.93 億元，三大法人合計賣超 1,398.44 億元。</w:t>
+      </w:r>
+    </w:p>
+    <w:p>
+      <w:r>
+        <w:t>• 融資餘額 6,339 億元（單日 +16.1 億）；擔保維持率 271.35%（較前日 -3.15）；信用風險戶數 23 戶（維持率不足 13｜追繳 7｜處分 3）——證交所 10/29 官方值（10/30 官方尚未納入）。</w:t>
+      </w:r>
+    </w:p>
+    <w:p>
+      <w:r>
+        <w:t>• 費城半導體 10/29 收 11,518.20（-1.42%）；10/30 美股尚未開盤，那指期貨盤前跌逾 2%（亞馬遜、英特爾財報）。</w:t>
       </w:r>
     </w:p>
     <w:p>
       <w:r>
         <w:rPr>
-          <w:rFonts w:ascii="Microsoft JhengHei" w:hAnsi="Microsoft JhengHei" w:eastAsia="Microsoft JhengHei"/>
-          <w:b w:val="0"/>
-        </w:rPr>
-        <w:t>• 融資餘額 6,339 億元（單日 +16.1 億）；擔保維持率 271.35%（較前日 -3.15）；信用風險戶數 23 戶（維持率不足 13｜追繳 7｜處分 3）——證交所 10/29 官方值。</w:t>
-      </w:r>
-    </w:p>
-    <w:p>
-      <w:r>
-        <w:rPr>
-          <w:rFonts w:ascii="Microsoft JhengHei" w:hAnsi="Microsoft JhengHei" w:eastAsia="Microsoft JhengHei"/>
-          <w:b w:val="0"/>
-        </w:rPr>
-        <w:t>• 三大法人合計賣超 816.66 億元（外資 -688.15 億、投信 +86.49 億、自營商約 -215 億）；新台幣收 32.492 元。</w:t>
-      </w:r>
-    </w:p>
-    <w:p>
-      <w:r>
-        <w:rPr>
-          <w:rFonts w:ascii="Microsoft JhengHei" w:hAnsi="Microsoft JhengHei" w:eastAsia="Microsoft JhengHei"/>
-          <w:b w:val="0"/>
-        </w:rPr>
-        <w:t>• 美股 10/29：道瓊 52,163.07（-0.59%）、那指 26,108.35（-1.66%）、標普 7,695.25（-0.63%），費半約 -2%（民視新聞網）；10/28 費半官方收 11,684.00（+1.75%）。</w:t>
-      </w:r>
-    </w:p>
-    <w:p>
-      <w:r>
-        <w:rPr>
-          <w:rFonts w:ascii="Microsoft JhengHei" w:hAnsi="Microsoft JhengHei" w:eastAsia="Microsoft JhengHei"/>
           <w:b/>
         </w:rPr>
-        <w:t>當日資金流向前五族群（證交所 MI_INDEX，資料日 10/29）</w:t>
+        <w:t>當日資金流向前五族群（證交所 MI_INDEX，資料日 10/30）</w:t>
       </w:r>
     </w:p>
     <w:tbl>
@@ -729,13 +314,7 @@
             <w:tcW w:type="dxa" w:w="2160"/>
           </w:tcPr>
           <w:p>
-            <w:r/>
             <w:r>
-              <w:rPr>
-                <w:rFonts w:ascii="Microsoft JhengHei" w:hAnsi="Microsoft JhengHei" w:eastAsia="Microsoft JhengHei"/>
-                <w:b/>
-                <w:sz w:val="18"/>
-              </w:rPr>
               <w:t>排名</w:t>
             </w:r>
           </w:p>
@@ -745,13 +324,7 @@
             <w:tcW w:type="dxa" w:w="2160"/>
           </w:tcPr>
           <w:p>
-            <w:r/>
             <w:r>
-              <w:rPr>
-                <w:rFonts w:ascii="Microsoft JhengHei" w:hAnsi="Microsoft JhengHei" w:eastAsia="Microsoft JhengHei"/>
-                <w:b/>
-                <w:sz w:val="18"/>
-              </w:rPr>
               <w:t>族群</w:t>
             </w:r>
           </w:p>
@@ -761,13 +334,7 @@
             <w:tcW w:type="dxa" w:w="2160"/>
           </w:tcPr>
           <w:p>
-            <w:r/>
             <w:r>
-              <w:rPr>
-                <w:rFonts w:ascii="Microsoft JhengHei" w:hAnsi="Microsoft JhengHei" w:eastAsia="Microsoft JhengHei"/>
-                <w:b/>
-                <w:sz w:val="18"/>
-              </w:rPr>
               <w:t>漲跌%</w:t>
             </w:r>
           </w:p>
@@ -777,13 +344,7 @@
             <w:tcW w:type="dxa" w:w="2160"/>
           </w:tcPr>
           <w:p>
-            <w:r/>
             <w:r>
-              <w:rPr>
-                <w:rFonts w:ascii="Microsoft JhengHei" w:hAnsi="Microsoft JhengHei" w:eastAsia="Microsoft JhengHei"/>
-                <w:b/>
-                <w:sz w:val="18"/>
-              </w:rPr>
               <w:t>最強 5 檔</w:t>
             </w:r>
           </w:p>
@@ -795,12 +356,7 @@
             <w:tcW w:type="dxa" w:w="2160"/>
           </w:tcPr>
           <w:p>
-            <w:r/>
             <w:r>
-              <w:rPr>
-                <w:rFonts w:ascii="Microsoft JhengHei" w:hAnsi="Microsoft JhengHei" w:eastAsia="Microsoft JhengHei"/>
-                <w:sz w:val="18"/>
-              </w:rPr>
               <w:t>1</w:t>
             </w:r>
           </w:p>
@@ -810,13 +366,8 @@
             <w:tcW w:type="dxa" w:w="2160"/>
           </w:tcPr>
           <w:p>
-            <w:r/>
             <w:r>
-              <w:rPr>
-                <w:rFonts w:ascii="Microsoft JhengHei" w:hAnsi="Microsoft JhengHei" w:eastAsia="Microsoft JhengHei"/>
-                <w:sz w:val="18"/>
-              </w:rPr>
-              <w:t>生技醫療</w:t>
+              <w:t>航運</w:t>
             </w:r>
           </w:p>
         </w:tc>
@@ -825,13 +376,8 @@
             <w:tcW w:type="dxa" w:w="2160"/>
           </w:tcPr>
           <w:p>
-            <w:r/>
             <w:r>
-              <w:rPr>
-                <w:rFonts w:ascii="Microsoft JhengHei" w:hAnsi="Microsoft JhengHei" w:eastAsia="Microsoft JhengHei"/>
-                <w:sz w:val="18"/>
-              </w:rPr>
-              <w:t>+1.10%</w:t>
+              <w:t>+1.93%</w:t>
             </w:r>
           </w:p>
         </w:tc>
@@ -840,13 +386,8 @@
             <w:tcW w:type="dxa" w:w="2160"/>
           </w:tcPr>
           <w:p>
-            <w:r/>
             <w:r>
-              <w:rPr>
-                <w:rFonts w:ascii="Microsoft JhengHei" w:hAnsi="Microsoft JhengHei" w:eastAsia="Microsoft JhengHei"/>
-                <w:sz w:val="18"/>
-              </w:rPr>
-              <w:t>科妍(1786) +9.91%、訊映(4155) +3.96%、藥華藥(6446) +3.33%、沛爾生醫*-創(6949) +2.90%、晉弘(6796) +2.71%</w:t>
+              <w:t>萬海(2615) +4.35%、長榮(2603) +4.02%、陽明(2609) +2.42%、裕民(2606) +2.29%、榮運(2607) +1.57%</w:t>
             </w:r>
           </w:p>
         </w:tc>
@@ -857,12 +398,7 @@
             <w:tcW w:type="dxa" w:w="2160"/>
           </w:tcPr>
           <w:p>
-            <w:r/>
             <w:r>
-              <w:rPr>
-                <w:rFonts w:ascii="Microsoft JhengHei" w:hAnsi="Microsoft JhengHei" w:eastAsia="Microsoft JhengHei"/>
-                <w:sz w:val="18"/>
-              </w:rPr>
               <w:t>2</w:t>
             </w:r>
           </w:p>
@@ -872,13 +408,8 @@
             <w:tcW w:type="dxa" w:w="2160"/>
           </w:tcPr>
           <w:p>
-            <w:r/>
             <w:r>
-              <w:rPr>
-                <w:rFonts w:ascii="Microsoft JhengHei" w:hAnsi="Microsoft JhengHei" w:eastAsia="Microsoft JhengHei"/>
-                <w:sz w:val="18"/>
-              </w:rPr>
-              <w:t>金融保險</w:t>
+              <w:t>食品</w:t>
             </w:r>
           </w:p>
         </w:tc>
@@ -887,13 +418,8 @@
             <w:tcW w:type="dxa" w:w="2160"/>
           </w:tcPr>
           <w:p>
-            <w:r/>
             <w:r>
-              <w:rPr>
-                <w:rFonts w:ascii="Microsoft JhengHei" w:hAnsi="Microsoft JhengHei" w:eastAsia="Microsoft JhengHei"/>
-                <w:sz w:val="18"/>
-              </w:rPr>
-              <w:t>+1.05%</w:t>
+              <w:t>+0.89%</w:t>
             </w:r>
           </w:p>
         </w:tc>
@@ -902,13 +428,8 @@
             <w:tcW w:type="dxa" w:w="2160"/>
           </w:tcPr>
           <w:p>
-            <w:r/>
             <w:r>
-              <w:rPr>
-                <w:rFonts w:ascii="Microsoft JhengHei" w:hAnsi="Microsoft JhengHei" w:eastAsia="Microsoft JhengHei"/>
-                <w:sz w:val="18"/>
-              </w:rPr>
-              <w:t>第一金(2892) +3.86%、彰銀(2801) +1.84%、兆豐金(2886) +1.67%、華南金(2880) +1.62%、合庫金(5880) +1.58%</w:t>
+              <w:t>味全(1201) +9.72%、統一(1216) +1.52%、宏亞(1236) +1.32%、大成(1210) +1.18%、味王(1203) +1.14%</w:t>
             </w:r>
           </w:p>
         </w:tc>
@@ -919,12 +440,7 @@
             <w:tcW w:type="dxa" w:w="2160"/>
           </w:tcPr>
           <w:p>
-            <w:r/>
             <w:r>
-              <w:rPr>
-                <w:rFonts w:ascii="Microsoft JhengHei" w:hAnsi="Microsoft JhengHei" w:eastAsia="Microsoft JhengHei"/>
-                <w:sz w:val="18"/>
-              </w:rPr>
               <w:t>3</w:t>
             </w:r>
           </w:p>
@@ -934,13 +450,8 @@
             <w:tcW w:type="dxa" w:w="2160"/>
           </w:tcPr>
           <w:p>
-            <w:r/>
             <w:r>
-              <w:rPr>
-                <w:rFonts w:ascii="Microsoft JhengHei" w:hAnsi="Microsoft JhengHei" w:eastAsia="Microsoft JhengHei"/>
-                <w:sz w:val="18"/>
-              </w:rPr>
-              <w:t>水泥</w:t>
+              <w:t>貿易百貨</w:t>
             </w:r>
           </w:p>
         </w:tc>
@@ -949,13 +460,8 @@
             <w:tcW w:type="dxa" w:w="2160"/>
           </w:tcPr>
           <w:p>
-            <w:r/>
             <w:r>
-              <w:rPr>
-                <w:rFonts w:ascii="Microsoft JhengHei" w:hAnsi="Microsoft JhengHei" w:eastAsia="Microsoft JhengHei"/>
-                <w:sz w:val="18"/>
-              </w:rPr>
-              <w:t>+0.46%</w:t>
+              <w:t>+0.67%</w:t>
             </w:r>
           </w:p>
         </w:tc>
@@ -964,13 +470,8 @@
             <w:tcW w:type="dxa" w:w="2160"/>
           </w:tcPr>
           <w:p>
-            <w:r/>
             <w:r>
-              <w:rPr>
-                <w:rFonts w:ascii="Microsoft JhengHei" w:hAnsi="Microsoft JhengHei" w:eastAsia="Microsoft JhengHei"/>
-                <w:sz w:val="18"/>
-              </w:rPr>
-              <w:t>台泥(1101) +0.71%、嘉泥(1103) +0.36%、亞泥(1102) +0.27%、台泥乙特(1101B) +0.00%、環泥(1104) +0.00%</w:t>
+              <w:t>永邑-KY(2939) +1.69%、統一超(2912) +1.58%、特力(2908) +0.23%、三商家購(2945) -0.38%、潤泰全(2915) -0.52%</w:t>
             </w:r>
           </w:p>
         </w:tc>
@@ -981,12 +482,7 @@
             <w:tcW w:type="dxa" w:w="2160"/>
           </w:tcPr>
           <w:p>
-            <w:r/>
             <w:r>
-              <w:rPr>
-                <w:rFonts w:ascii="Microsoft JhengHei" w:hAnsi="Microsoft JhengHei" w:eastAsia="Microsoft JhengHei"/>
-                <w:sz w:val="18"/>
-              </w:rPr>
               <w:t>4</w:t>
             </w:r>
           </w:p>
@@ -996,13 +492,8 @@
             <w:tcW w:type="dxa" w:w="2160"/>
           </w:tcPr>
           <w:p>
-            <w:r/>
             <w:r>
-              <w:rPr>
-                <w:rFonts w:ascii="Microsoft JhengHei" w:hAnsi="Microsoft JhengHei" w:eastAsia="Microsoft JhengHei"/>
-                <w:sz w:val="18"/>
-              </w:rPr>
-              <w:t>食品</w:t>
+              <w:t>水泥</w:t>
             </w:r>
           </w:p>
         </w:tc>
@@ -1011,13 +502,8 @@
             <w:tcW w:type="dxa" w:w="2160"/>
           </w:tcPr>
           <w:p>
-            <w:r/>
             <w:r>
-              <w:rPr>
-                <w:rFonts w:ascii="Microsoft JhengHei" w:hAnsi="Microsoft JhengHei" w:eastAsia="Microsoft JhengHei"/>
-                <w:sz w:val="18"/>
-              </w:rPr>
-              <w:t>+0.32%</w:t>
+              <w:t>+0.45%</w:t>
             </w:r>
           </w:p>
         </w:tc>
@@ -1026,13 +512,8 @@
             <w:tcW w:type="dxa" w:w="2160"/>
           </w:tcPr>
           <w:p>
-            <w:r/>
             <w:r>
-              <w:rPr>
-                <w:rFonts w:ascii="Microsoft JhengHei" w:hAnsi="Microsoft JhengHei" w:eastAsia="Microsoft JhengHei"/>
-                <w:sz w:val="18"/>
-              </w:rPr>
-              <w:t>味全(1201) +5.56%、福壽(1219) +1.79%、聯華(1229) +0.76%、佳格(1227) +0.73%、統一(1216) +0.38%</w:t>
+              <w:t>亞泥(1102) +0.66%、台泥(1101) +0.53%、幸福(1108) +0.00%、信大(1109) +0.00%、台泥乙特(1101B) -0.23%</w:t>
             </w:r>
           </w:p>
         </w:tc>
@@ -1043,12 +524,7 @@
             <w:tcW w:type="dxa" w:w="2160"/>
           </w:tcPr>
           <w:p>
-            <w:r/>
             <w:r>
-              <w:rPr>
-                <w:rFonts w:ascii="Microsoft JhengHei" w:hAnsi="Microsoft JhengHei" w:eastAsia="Microsoft JhengHei"/>
-                <w:sz w:val="18"/>
-              </w:rPr>
               <w:t>5</w:t>
             </w:r>
           </w:p>
@@ -1058,13 +534,8 @@
             <w:tcW w:type="dxa" w:w="2160"/>
           </w:tcPr>
           <w:p>
-            <w:r/>
             <w:r>
-              <w:rPr>
-                <w:rFonts w:ascii="Microsoft JhengHei" w:hAnsi="Microsoft JhengHei" w:eastAsia="Microsoft JhengHei"/>
-                <w:sz w:val="18"/>
-              </w:rPr>
-              <w:t>紡織纖維</w:t>
+              <w:t>玻璃陶瓷</w:t>
             </w:r>
           </w:p>
         </w:tc>
@@ -1073,13 +544,8 @@
             <w:tcW w:type="dxa" w:w="2160"/>
           </w:tcPr>
           <w:p>
-            <w:r/>
             <w:r>
-              <w:rPr>
-                <w:rFonts w:ascii="Microsoft JhengHei" w:hAnsi="Microsoft JhengHei" w:eastAsia="Microsoft JhengHei"/>
-                <w:sz w:val="18"/>
-              </w:rPr>
-              <w:t>+0.04%</w:t>
+              <w:t>+0.16%</w:t>
             </w:r>
           </w:p>
         </w:tc>
@@ -1088,13 +554,8 @@
             <w:tcW w:type="dxa" w:w="2160"/>
           </w:tcPr>
           <w:p>
-            <w:r/>
             <w:r>
-              <w:rPr>
-                <w:rFonts w:ascii="Microsoft JhengHei" w:hAnsi="Microsoft JhengHei" w:eastAsia="Microsoft JhengHei"/>
-                <w:sz w:val="18"/>
-              </w:rPr>
-              <w:t>儒鴻(1476) +1.42%、聚隆(1466) +1.40%、宏洲(1413) +0.97%、遠東新(1402) +0.71%、新紡(1419) +0.46%</w:t>
+              <w:t>凱撒衛(1817) +1.25%、台玻(1802) +0.48%、冠軍(1806) -0.90%、和成(1810) -1.81%、中釉(1809) -5.56%</w:t>
             </w:r>
           </w:p>
         </w:tc>
@@ -1103,7 +564,6 @@
     <w:p>
       <w:r>
         <w:rPr>
-          <w:rFonts w:ascii="Microsoft JhengHei" w:hAnsi="Microsoft JhengHei" w:eastAsia="Microsoft JhengHei"/>
           <w:b/>
         </w:rPr>
         <w:t>四、來源</w:t>
@@ -1111,100 +571,46 @@
     </w:p>
     <w:p>
       <w:r>
-        <w:rPr>
-          <w:rFonts w:ascii="Microsoft JhengHei" w:hAnsi="Microsoft JhengHei" w:eastAsia="Microsoft JhengHei"/>
-          <w:b w:val="0"/>
-        </w:rPr>
-        <w:t>1. 工商時報｜聯電(2303)急殺跌停！外資看法分歧 目標價 135 至 200 元（10/29 13:09）　https://www.chinatimes.com/realtimenews/20261029002526-260410</w:t>
+        <w:t>1. 聯合新聞網｜聯電（2303）昨跌停外資卻喊加碼！大摩目標價188元（10/30 09:28）　https://udn.com/news/story/12806/9846273</w:t>
       </w:r>
     </w:p>
     <w:p>
       <w:r>
-        <w:rPr>
-          <w:rFonts w:ascii="Microsoft JhengHei" w:hAnsi="Microsoft JhengHei" w:eastAsia="Microsoft JhengHei"/>
-          <w:b w:val="0"/>
-        </w:rPr>
-        <w:t>2. 經濟日報｜玉晶光(3406)漲停後急殺跌停！外資喊價 1,415 元 為何反轉？（10/29 11:03）　https://money.udn.com/money/story/5710/9844148</w:t>
+        <w:t>2. 三立新聞網｜Q3獲利大暴增358%！「這ABF載板大廠」稼動率破9成 目標價至1300元（10/30 01:30）　https://www.setn.com/news/1930323</w:t>
       </w:r>
     </w:p>
     <w:p>
       <w:r>
-        <w:rPr>
-          <w:rFonts w:ascii="Microsoft JhengHei" w:hAnsi="Microsoft JhengHei" w:eastAsia="Microsoft JhengHei"/>
-          <w:b w:val="0"/>
-        </w:rPr>
-        <w:t>3. 經濟日報｜玉晶光(3406)有潛力 花旗喊買（10/29）　https://money.udn.com/money/story/5710/9843040?from=edn_related_storybottom</w:t>
+        <w:t>3. 三立新聞網｜快訊／台指期夜盤重挫！失守4萬5千點大關（10/30 20:12）　https://www.setn.com/news/1931074</w:t>
       </w:r>
     </w:p>
     <w:p>
       <w:r>
-        <w:rPr>
-          <w:rFonts w:ascii="Microsoft JhengHei" w:hAnsi="Microsoft JhengHei" w:eastAsia="Microsoft JhengHei"/>
-          <w:b w:val="0"/>
-        </w:rPr>
-        <w:t>4. 民視新聞網｜Alphabet 財報失色引發 AI 隱憂 美股三大指數齊跌 那指挫 1.6%（10/30）　https://www.ftvnews.com.tw/news/detail/2026A30W0024</w:t>
+        <w:t>4. Business Insider Taiwan｜台股從高點跌掉 4,610 點、半年線也失守 小摩示警（10/30 19:53）　https://www.businessinsider.tw/article/9023</w:t>
       </w:r>
     </w:p>
     <w:p>
       <w:r>
-        <w:rPr>
-          <w:rFonts w:ascii="Microsoft JhengHei" w:hAnsi="Microsoft JhengHei" w:eastAsia="Microsoft JhengHei"/>
-          <w:b w:val="0"/>
-        </w:rPr>
-        <w:t>5. 經濟日報｜AI 投資榮景會持久嗎？克魯曼大膽預言：將遭遇兩大障礙（10/29 23:29）　https://money.udn.com/money/story/5599/9845847</w:t>
+        <w:t>5. NOWnews｜台股崩跌逾千點？金管會信心喊話（10/30 18:20）　https://www.nownews.com/news/6887974</w:t>
       </w:r>
     </w:p>
     <w:p>
       <w:r>
-        <w:rPr>
-          <w:rFonts w:ascii="Microsoft JhengHei" w:hAnsi="Microsoft JhengHei" w:eastAsia="Microsoft JhengHei"/>
-          <w:b w:val="0"/>
-        </w:rPr>
-        <w:t>6. 經濟日報｜伊朗戰爭最大受益者！歐洲 3 石油巨人獲利激增、宣布擴大回饋股東（10/29）　https://money.udn.com/money/story/5599/9845690?from=edn_hotestlist_storybottom</w:t>
+        <w:t>6. 鉅亨網｜外資單日重砍台股1124億元創史上第七大賣超 反手布局防禦型傳產股（10/30 17:44）　https://news.cnyes.com/news/id/6641939</w:t>
       </w:r>
     </w:p>
     <w:p>
       <w:r>
-        <w:rPr>
-          <w:rFonts w:ascii="Microsoft JhengHei" w:hAnsi="Microsoft JhengHei" w:eastAsia="Microsoft JhengHei"/>
-          <w:b w:val="0"/>
-        </w:rPr>
-        <w:t>7. 經濟日報｜美第 3 季 GDP 擴張 3.4% 高於預期 9 月核心通膨年增 3.1%（10/29 22:07）　https://money.udn.com/money/story/5599/9845681?from=edn_editorrelated_story</w:t>
+        <w:t>7. 工商時報｜45K保衛戰開打 台指期夜盤小彈（10/30 17:43）　https://www.chinatimes.com/realtimenews/20261030003422-260410</w:t>
       </w:r>
     </w:p>
     <w:p>
       <w:r>
-        <w:rPr>
-          <w:rFonts w:ascii="Microsoft JhengHei" w:hAnsi="Microsoft JhengHei" w:eastAsia="Microsoft JhengHei"/>
-          <w:b w:val="0"/>
-        </w:rPr>
-        <w:t>8. 中時新聞網｜憂 AI 投資回報 台指期夜盤回防 46K 大關 那指下殺近 500 點（10/29 21:38）　https://www.chinatimes.com/realtimenews/20261029004693-260410</w:t>
+        <w:t>8. 臺灣證券交易所 FMTQIK／MI_MARGN／BFIJ4U_TREND／MI_INDEX（data/market、data/sectors 自動擷取）</w:t>
       </w:r>
     </w:p>
     <w:p>
       <w:r>
-        <w:rPr>
-          <w:rFonts w:ascii="Microsoft JhengHei" w:hAnsi="Microsoft JhengHei" w:eastAsia="Microsoft JhengHei"/>
-          <w:b w:val="0"/>
-        </w:rPr>
-        <w:t>9. 中央社（Yahoo新聞）｜瑞儀(6176)第 3 季每股賺 2.31 元 高雄七廠布局超穎透鏡等產品（10/29）　https://tw.news.yahoo.com/%E7%91%9E%E5%84%80%E7%AC%AC3%E5%AD%A3%E6%AF%8F%E8%82%A1%E8%B3%BA2-31%E5%85%83-%E9%AB%98%E9%9B%84%E4%B8%83%E5%BB%A0%E5%B8%83%E5%B1%80%E8%B6%85%E7%A9%8E%E9%80%8F%E9%8F%A1%E7%AD%89%E7%94%A2%E5%93%81-125141930.html</w:t>
-      </w:r>
-    </w:p>
-    <w:p>
-      <w:r>
-        <w:rPr>
-          <w:rFonts w:ascii="Microsoft JhengHei" w:hAnsi="Microsoft JhengHei" w:eastAsia="Microsoft JhengHei"/>
-          <w:b w:val="0"/>
-        </w:rPr>
-        <w:t>10. 臺灣證券交易所 FMTQIK／MI_MARGN／BFIJ4U_TREND／MI_INDEX（官方值 10/29，自動擷取）</w:t>
-      </w:r>
-    </w:p>
-    <w:p>
-      <w:r>
-        <w:rPr>
-          <w:rFonts w:ascii="Microsoft JhengHei" w:hAnsi="Microsoft JhengHei" w:eastAsia="Microsoft JhengHei"/>
-          <w:b w:val="0"/>
-        </w:rPr>
         <w:t>※ 本報告依公開新聞整理，非完整報告。</w:t>
       </w:r>
     </w:p>

</xml_diff>